<commit_message>
final_report: resolve Appendix G/H duplication and apply targeted polish
- Unify Appendix G to a single coherent section containing both the Experimental Artifact Map (Table G.1) and Local Execution Traces (with Figure G.1 caption)
- Unify Appendix H to a single coherent section containing core implementation source code listings (Listings H.1-H.3)
- Remove all duplicate trailing copies of Appendix G and Appendix H
- Ensure code and terminal listings use breaklines to stay strictly within page margins
- Recompile PDF via XeLaTeX (61 pages clean, 0 errors)
- Synchronize DOCX with bold supervisor name, increased certificate signature spacing, centered chapter/appendix headings, and clean formatting
</commit_message>
<xml_diff>
--- a/final_report/DSN4091_Capstone_Phase-I_Final_Report.docx
+++ b/final_report/DSN4091_Capstone_Phase-I_Final_Report.docx
@@ -506,238 +506,6 @@
         <w:t xml:space="preserve"/>
       </w:r>
     </w:p>
-    <w:tbl>
-      <w:tblPr>
-        <w:tblW w:w="9360" w:type="dxa"/>
-        <w:jc w:val="center"/>
-        <w:tblBorders>
-          <w:top w:val="none"/>
-          <w:left w:val="none"/>
-          <w:bottom w:val="none"/>
-          <w:right w:val="none"/>
-          <w:insideH w:val="none"/>
-          <w:insideV w:val="none"/>
-        </w:tblBorders>
-      </w:tblPr>
-      <w:tblGrid>
-        <w:gridCol w:w="4680"/>
-        <w:gridCol w:w="4680"/>
-      </w:tblGrid>
-      <w:tr>
-        <w:tc>
-          <w:tcPr>
-            <w:tcW w:w="4680" w:type="dxa"/>
-          </w:tcPr>
-          <w:p>
-            <w:pPr>
-              <w:jc w:val="center"/>
-            </w:pPr>
-            <w:r>
-              <w:rPr>
-                <w:rFonts w:ascii="Times New Roman" w:hAnsi="Times New Roman"/>
-                <w:b/>
-                <w:sz w:val="24"/>
-              </w:rPr>
-              <w:t>PROGRAM CHAIR</w:t>
-            </w:r>
-          </w:p>
-          <w:p>
-            <w:pPr>
-              <w:jc w:val="center"/>
-            </w:pPr>
-            <w:r>
-              <w:rPr>
-                <w:rFonts w:ascii="Times New Roman" w:hAnsi="Times New Roman"/>
-                <w:b/>
-                <w:sz w:val="22"/>
-              </w:rPr>
-              <w:t>Dr Pradeep Kumar Mishra</w:t>
-            </w:r>
-          </w:p>
-          <w:p>
-            <w:pPr>
-              <w:jc w:val="center"/>
-            </w:pPr>
-            <w:r>
-              <w:rPr>
-                <w:rFonts w:ascii="Times New Roman" w:hAnsi="Times New Roman"/>
-                <w:sz w:val="20"/>
-              </w:rPr>
-              <w:t>Senior Assistant Professor (Gr-2)</w:t>
-            </w:r>
-          </w:p>
-          <w:p>
-            <w:pPr>
-              <w:jc w:val="center"/>
-            </w:pPr>
-            <w:r>
-              <w:rPr>
-                <w:rFonts w:ascii="Times New Roman" w:hAnsi="Times New Roman"/>
-                <w:sz w:val="20"/>
-              </w:rPr>
-              <w:t>School of Computing Science Engineering</w:t>
-            </w:r>
-          </w:p>
-          <w:p>
-            <w:pPr>
-              <w:jc w:val="center"/>
-            </w:pPr>
-            <w:r>
-              <w:rPr>
-                <w:rFonts w:ascii="Times New Roman" w:hAnsi="Times New Roman"/>
-                <w:sz w:val="20"/>
-              </w:rPr>
-              <w:t>and Artificial Intelligence</w:t>
-            </w:r>
-          </w:p>
-          <w:p>
-            <w:pPr>
-              <w:jc w:val="center"/>
-            </w:pPr>
-            <w:r>
-              <w:rPr>
-                <w:rFonts w:ascii="Times New Roman" w:hAnsi="Times New Roman"/>
-                <w:sz w:val="20"/>
-              </w:rPr>
-              <w:t>VIT Bhopal University</w:t>
-            </w:r>
-          </w:p>
-        </w:tc>
-        <w:tc>
-          <w:tcPr>
-            <w:tcW w:w="4680" w:type="dxa"/>
-          </w:tcPr>
-          <w:p>
-            <w:pPr>
-              <w:jc w:val="center"/>
-            </w:pPr>
-            <w:r>
-              <w:rPr>
-                <w:rFonts w:ascii="Times New Roman" w:hAnsi="Times New Roman"/>
-                <w:b/>
-                <w:sz w:val="24"/>
-              </w:rPr>
-              <w:t>PROJECT GUIDE</w:t>
-            </w:r>
-          </w:p>
-          <w:p>
-            <w:pPr>
-              <w:jc w:val="center"/>
-            </w:pPr>
-            <w:r>
-              <w:rPr>
-                <w:rFonts w:ascii="Times New Roman" w:hAnsi="Times New Roman"/>
-                <w:b/>
-                <w:sz w:val="22"/>
-              </w:rPr>
-              <w:t>Dr Pradeep Kumar Mishra</w:t>
-            </w:r>
-          </w:p>
-          <w:p>
-            <w:pPr>
-              <w:jc w:val="center"/>
-            </w:pPr>
-            <w:r>
-              <w:rPr>
-                <w:rFonts w:ascii="Times New Roman" w:hAnsi="Times New Roman"/>
-                <w:sz w:val="20"/>
-              </w:rPr>
-              <w:t>Senior Assistant Professor (Gr-2)</w:t>
-            </w:r>
-          </w:p>
-          <w:p>
-            <w:pPr>
-              <w:jc w:val="center"/>
-            </w:pPr>
-            <w:r>
-              <w:rPr>
-                <w:rFonts w:ascii="Times New Roman" w:hAnsi="Times New Roman"/>
-                <w:sz w:val="20"/>
-              </w:rPr>
-              <w:t>School of Computing Science Engineering</w:t>
-            </w:r>
-          </w:p>
-          <w:p>
-            <w:pPr>
-              <w:jc w:val="center"/>
-            </w:pPr>
-            <w:r>
-              <w:rPr>
-                <w:rFonts w:ascii="Times New Roman" w:hAnsi="Times New Roman"/>
-                <w:sz w:val="20"/>
-              </w:rPr>
-              <w:t>and Artificial Intelligence</w:t>
-            </w:r>
-          </w:p>
-          <w:p>
-            <w:pPr>
-              <w:jc w:val="center"/>
-            </w:pPr>
-            <w:r>
-              <w:rPr>
-                <w:rFonts w:ascii="Times New Roman" w:hAnsi="Times New Roman"/>
-                <w:sz w:val="20"/>
-              </w:rPr>
-              <w:t>VIT Bhopal University</w:t>
-            </w:r>
-          </w:p>
-        </w:tc>
-      </w:tr>
-    </w:tbl>
-    <w:p>
-      <w:pPr>
-        <w:jc w:val="left"/>
-        <w:spacing w:before="240" w:after="0"/>
-      </w:pPr>
-      <w:r>
-        <w:rPr>
-          <w:rFonts w:ascii="Times New Roman" w:hAnsi="Times New Roman" w:cs="Times New Roman"/>
-          <w:sz w:val="22"/>
-          <w:szCs w:val="22"/>
-          <w:color w:val="000000"/>
-        </w:rPr>
-        <w:t xml:space="preserve">The DSN4091 – Capstone Project Phase-I Viva Voce Examination is held on ____________.</w:t>
-      </w:r>
-      <w:r>
-        <w:br w:type="page"/>
-      </w:r>
-    </w:p>
-    <w:p>
-      <w:pPr>
-        <w:jc w:val="center"/>
-        <w:spacing w:before="180" w:after="160"/>
-      </w:pPr>
-      <w:r>
-        <w:rPr>
-          <w:rFonts w:ascii="Times New Roman" w:hAnsi="Times New Roman" w:cs="Times New Roman"/>
-          <w:b/>
-          <w:bCs/>
-          <w:sz w:val="28"/>
-          <w:szCs w:val="28"/>
-          <w:color w:val="000000"/>
-        </w:rPr>
-        <w:t xml:space="preserve">DECLARATION</w:t>
-      </w:r>
-    </w:p>
-    <w:p>
-      <w:pPr>
-        <w:jc w:val="both"/>
-        <w:spacing w:before="60" w:after="180"/>
-      </w:pPr>
-      <w:r>
-        <w:rPr>
-          <w:rFonts w:ascii="Times New Roman" w:hAnsi="Times New Roman" w:cs="Times New Roman"/>
-          <w:sz w:val="24"/>
-          <w:szCs w:val="24"/>
-          <w:color w:val="000000"/>
-        </w:rPr>
-        <w:t xml:space="preserve">We hereby declare that the project work entitled "EVIDENCE-DRIVEN DATASET INTELLIGENCE AND RECOMMENDATION SYSTEM" submitted to VIT Bhopal University, Bhopal in partial fulfillment of the requirements for the award of the degree of Bachelor of Technology in Computer Science and Engineering (Artificial Intelligence and Machine Learning) is a bonafide record of original work done by us under the supervision and guidance of Dr. Pradeep Kumar Mishra, Senior Assistant Professor (Gr-2), School of Computing Science and Engineering, VIT Bhopal University.</w:t>
-        <w:br/>
-        <w:t xml:space="preserve"/>
-        <w:br/>
-        <w:t xml:space="preserve">We further declare that to the best of our knowledge, the results and work embodied in this Phase-I report have not been submitted to any other University or Institute for the award of any degree or diploma. All contributions, software libraries, benchmarks, and published literature referenced in this work have been explicitly cited and acknowledged.</w:t>
-      </w:r>
-    </w:p>
     <w:p>
       <w:pPr>
         <w:jc w:val="left"/>
@@ -802,6 +570,306 @@
       </w:tblGrid>
       <w:tr>
         <w:tc>
+          <w:tcPr>
+            <w:tcW w:w="4680" w:type="dxa"/>
+          </w:tcPr>
+          <w:p>
+            <w:pPr>
+              <w:jc w:val="center"/>
+            </w:pPr>
+            <w:r>
+              <w:rPr>
+                <w:rFonts w:ascii="Times New Roman" w:hAnsi="Times New Roman"/>
+                <w:b/>
+                <w:sz w:val="24"/>
+              </w:rPr>
+              <w:t>PROGRAM CHAIR</w:t>
+            </w:r>
+          </w:p>
+          <w:p>
+            <w:pPr>
+              <w:jc w:val="center"/>
+            </w:pPr>
+            <w:r>
+              <w:rPr>
+                <w:rFonts w:ascii="Times New Roman" w:hAnsi="Times New Roman"/>
+                <w:b/>
+                <w:sz w:val="22"/>
+              </w:rPr>
+              <w:t>Dr Pradeep Kumar Mishra</w:t>
+            </w:r>
+          </w:p>
+          <w:p>
+            <w:pPr>
+              <w:jc w:val="center"/>
+            </w:pPr>
+            <w:r>
+              <w:rPr>
+                <w:rFonts w:ascii="Times New Roman" w:hAnsi="Times New Roman"/>
+                <w:sz w:val="20"/>
+              </w:rPr>
+              <w:t>Senior Assistant Professor (Gr-2)</w:t>
+            </w:r>
+          </w:p>
+          <w:p>
+            <w:pPr>
+              <w:jc w:val="center"/>
+            </w:pPr>
+            <w:r>
+              <w:rPr>
+                <w:rFonts w:ascii="Times New Roman" w:hAnsi="Times New Roman"/>
+                <w:sz w:val="20"/>
+              </w:rPr>
+              <w:t>School of Computing Science Engineering</w:t>
+            </w:r>
+          </w:p>
+          <w:p>
+            <w:pPr>
+              <w:jc w:val="center"/>
+            </w:pPr>
+            <w:r>
+              <w:rPr>
+                <w:rFonts w:ascii="Times New Roman" w:hAnsi="Times New Roman"/>
+                <w:sz w:val="20"/>
+              </w:rPr>
+              <w:t>and Artificial Intelligence</w:t>
+            </w:r>
+          </w:p>
+          <w:p>
+            <w:pPr>
+              <w:jc w:val="center"/>
+            </w:pPr>
+            <w:r>
+              <w:rPr>
+                <w:rFonts w:ascii="Times New Roman" w:hAnsi="Times New Roman"/>
+                <w:sz w:val="20"/>
+              </w:rPr>
+              <w:t>VIT Bhopal University</w:t>
+            </w:r>
+          </w:p>
+        </w:tc>
+        <w:tc>
+          <w:tcPr>
+            <w:tcW w:w="4680" w:type="dxa"/>
+          </w:tcPr>
+          <w:p>
+            <w:pPr>
+              <w:jc w:val="center"/>
+            </w:pPr>
+            <w:r>
+              <w:rPr>
+                <w:rFonts w:ascii="Times New Roman" w:hAnsi="Times New Roman"/>
+                <w:b/>
+                <w:sz w:val="24"/>
+              </w:rPr>
+              <w:t>PROJECT GUIDE</w:t>
+            </w:r>
+          </w:p>
+          <w:p>
+            <w:pPr>
+              <w:jc w:val="center"/>
+            </w:pPr>
+            <w:r>
+              <w:rPr>
+                <w:rFonts w:ascii="Times New Roman" w:hAnsi="Times New Roman"/>
+                <w:b/>
+                <w:sz w:val="22"/>
+              </w:rPr>
+              <w:t>Dr Pradeep Kumar Mishra</w:t>
+            </w:r>
+          </w:p>
+          <w:p>
+            <w:pPr>
+              <w:jc w:val="center"/>
+            </w:pPr>
+            <w:r>
+              <w:rPr>
+                <w:rFonts w:ascii="Times New Roman" w:hAnsi="Times New Roman"/>
+                <w:sz w:val="20"/>
+              </w:rPr>
+              <w:t>Senior Assistant Professor (Gr-2)</w:t>
+            </w:r>
+          </w:p>
+          <w:p>
+            <w:pPr>
+              <w:jc w:val="center"/>
+            </w:pPr>
+            <w:r>
+              <w:rPr>
+                <w:rFonts w:ascii="Times New Roman" w:hAnsi="Times New Roman"/>
+                <w:sz w:val="20"/>
+              </w:rPr>
+              <w:t>School of Computing Science Engineering</w:t>
+            </w:r>
+          </w:p>
+          <w:p>
+            <w:pPr>
+              <w:jc w:val="center"/>
+            </w:pPr>
+            <w:r>
+              <w:rPr>
+                <w:rFonts w:ascii="Times New Roman" w:hAnsi="Times New Roman"/>
+                <w:sz w:val="20"/>
+              </w:rPr>
+              <w:t>and Artificial Intelligence</w:t>
+            </w:r>
+          </w:p>
+          <w:p>
+            <w:pPr>
+              <w:jc w:val="center"/>
+            </w:pPr>
+            <w:r>
+              <w:rPr>
+                <w:rFonts w:ascii="Times New Roman" w:hAnsi="Times New Roman"/>
+                <w:sz w:val="20"/>
+              </w:rPr>
+              <w:t>VIT Bhopal University</w:t>
+            </w:r>
+          </w:p>
+        </w:tc>
+      </w:tr>
+    </w:tbl>
+    <w:p>
+      <w:pPr>
+        <w:jc w:val="left"/>
+        <w:spacing w:before="240" w:after="0"/>
+      </w:pPr>
+      <w:r>
+        <w:rPr>
+          <w:rFonts w:ascii="Times New Roman" w:hAnsi="Times New Roman" w:cs="Times New Roman"/>
+          <w:sz w:val="22"/>
+          <w:szCs w:val="22"/>
+          <w:color w:val="000000"/>
+        </w:rPr>
+        <w:t xml:space="preserve">The DSN4091 – Capstone Project Phase-I Viva Voce Examination is held on ____________.</w:t>
+      </w:r>
+      <w:r>
+        <w:br w:type="page"/>
+      </w:r>
+    </w:p>
+    <w:p>
+      <w:pPr>
+        <w:jc w:val="center"/>
+        <w:spacing w:before="180" w:after="160"/>
+      </w:pPr>
+      <w:r>
+        <w:rPr>
+          <w:rFonts w:ascii="Times New Roman" w:hAnsi="Times New Roman" w:cs="Times New Roman"/>
+          <w:b/>
+          <w:bCs/>
+          <w:sz w:val="28"/>
+          <w:szCs w:val="28"/>
+          <w:color w:val="000000"/>
+        </w:rPr>
+        <w:t xml:space="preserve">DECLARATION</w:t>
+      </w:r>
+    </w:p>
+    <w:p>
+      <w:pPr>
+        <w:jc w:val="both"/>
+        <w:spacing w:before="60" w:after="120"/>
+      </w:pPr>
+      <w:r>
+        <w:rPr>
+          <w:rFonts w:ascii="Times New Roman" w:hAnsi="Times New Roman"/>
+          <w:sz w:val="24"/>
+        </w:rPr>
+        <w:t xml:space="preserve">We hereby declare that the project work entitled "EVIDENCE-DRIVEN DATASET INTELLIGENCE AND RECOMMENDATION SYSTEM" submitted to VIT Bhopal University, Bhopal in partial fulfillment of the requirements for the award of the degree of Bachelor of Technology in Computer Science and Engineering (Artificial Intelligence and Machine Learning) is a bonafide record of original work done by us under the supervision and guidance of </w:t>
+      </w:r>
+      <w:r>
+        <w:rPr>
+          <w:rFonts w:ascii="Times New Roman" w:hAnsi="Times New Roman"/>
+          <w:b/>
+          <w:bCs/>
+          <w:sz w:val="24"/>
+        </w:rPr>
+        <w:t xml:space="preserve">Dr. Pradeep Kumar Mishra</w:t>
+      </w:r>
+      <w:r>
+        <w:rPr>
+          <w:rFonts w:ascii="Times New Roman" w:hAnsi="Times New Roman"/>
+          <w:sz w:val="24"/>
+        </w:rPr>
+        <w:t xml:space="preserve">, Senior Assistant Professor (Gr-2), School of Computing Science and Engineering, VIT Bhopal University.</w:t>
+      </w:r>
+    </w:p>
+    <w:p>
+      <w:pPr>
+        <w:jc w:val="both"/>
+        <w:spacing w:before="60" w:after="180"/>
+      </w:pPr>
+      <w:r>
+        <w:rPr>
+          <w:rFonts w:ascii="Times New Roman" w:hAnsi="Times New Roman"/>
+          <w:sz w:val="24"/>
+        </w:rPr>
+        <w:t xml:space="preserve">We further declare that to the best of our knowledge, the results and work embodied in this Phase-I report have not been submitted to any other University or Institute for the award of any degree or diploma. All contributions, software libraries, benchmarks, and published literature referenced in this work have been explicitly cited and acknowledged.</w:t>
+      </w:r>
+    </w:p>
+    <w:p>
+      <w:pPr>
+        <w:jc w:val="left"/>
+        <w:spacing w:before="0" w:after="120"/>
+      </w:pPr>
+      <w:r>
+        <w:rPr>
+          <w:rFonts w:ascii="Times New Roman" w:hAnsi="Times New Roman" w:cs="Times New Roman"/>
+          <w:sz w:val="24"/>
+          <w:szCs w:val="24"/>
+          <w:color w:val="000000"/>
+        </w:rPr>
+        <w:t xml:space="preserve"/>
+      </w:r>
+    </w:p>
+    <w:p>
+      <w:pPr>
+        <w:jc w:val="left"/>
+        <w:spacing w:before="0" w:after="120"/>
+      </w:pPr>
+      <w:r>
+        <w:rPr>
+          <w:rFonts w:ascii="Times New Roman" w:hAnsi="Times New Roman" w:cs="Times New Roman"/>
+          <w:sz w:val="24"/>
+          <w:szCs w:val="24"/>
+          <w:color w:val="000000"/>
+        </w:rPr>
+        <w:t xml:space="preserve"/>
+      </w:r>
+    </w:p>
+    <w:p>
+      <w:pPr>
+        <w:jc w:val="left"/>
+        <w:spacing w:before="0" w:after="120"/>
+      </w:pPr>
+      <w:r>
+        <w:rPr>
+          <w:rFonts w:ascii="Times New Roman" w:hAnsi="Times New Roman" w:cs="Times New Roman"/>
+          <w:sz w:val="24"/>
+          <w:szCs w:val="24"/>
+          <w:color w:val="000000"/>
+        </w:rPr>
+        <w:t xml:space="preserve"/>
+      </w:r>
+    </w:p>
+    <w:tbl>
+      <w:tblPr>
+        <w:tblW w:w="9360" w:type="dxa"/>
+        <w:jc w:val="center"/>
+        <w:tblBorders>
+          <w:top w:val="none"/>
+          <w:left w:val="none"/>
+          <w:bottom w:val="none"/>
+          <w:right w:val="none"/>
+          <w:insideH w:val="none"/>
+          <w:insideV w:val="none"/>
+        </w:tblBorders>
+      </w:tblPr>
+      <w:tblGrid>
+        <w:gridCol w:w="4680"/>
+        <w:gridCol w:w="4680"/>
+      </w:tblGrid>
+      <w:tr>
+        <w:tc>
           <w:p>
             <w:r>
               <w:rPr>
@@ -938,12 +1006,26 @@
       </w:pPr>
       <w:r>
         <w:rPr>
-          <w:rFonts w:ascii="Times New Roman" w:hAnsi="Times New Roman" w:cs="Times New Roman"/>
+          <w:rFonts w:ascii="Times New Roman" w:hAnsi="Times New Roman"/>
           <w:sz w:val="24"/>
-          <w:szCs w:val="24"/>
-          <w:color w:val="000000"/>
         </w:rPr>
-        <w:t xml:space="preserve">We would like to thank Dr. Pradeep Kumar Mishra, our Project Guide and Program Chair, for continually guiding and actively participating in our project, and giving valuable suggestions to complete the project work.</w:t>
+        <w:t xml:space="preserve">We would like to thank </w:t>
+      </w:r>
+      <w:r>
+        <w:rPr>
+          <w:rFonts w:ascii="Times New Roman" w:hAnsi="Times New Roman"/>
+          <w:b/>
+          <w:bCs/>
+          <w:sz w:val="24"/>
+        </w:rPr>
+        <w:t xml:space="preserve">Dr. Pradeep Kumar Mishra</w:t>
+      </w:r>
+      <w:r>
+        <w:rPr>
+          <w:rFonts w:ascii="Times New Roman" w:hAnsi="Times New Roman"/>
+          <w:sz w:val="24"/>
+        </w:rPr>
+        <w:t xml:space="preserve">, our Project Guide and Program Chair, for continually guiding and actively participating in our project, and giving valuable suggestions to complete the project work.</w:t>
       </w:r>
     </w:p>
     <w:p>
@@ -953,12 +1035,26 @@
       </w:pPr>
       <w:r>
         <w:rPr>
-          <w:rFonts w:ascii="Times New Roman" w:hAnsi="Times New Roman" w:cs="Times New Roman"/>
+          <w:rFonts w:ascii="Times New Roman" w:hAnsi="Times New Roman"/>
           <w:sz w:val="24"/>
-          <w:szCs w:val="24"/>
-          <w:color w:val="000000"/>
         </w:rPr>
-        <w:t xml:space="preserve">We wish to express our heartfelt gratitude to Dr. Pradeep Kumar Mishra, PC-Lead, School of Computing Science Engineering and Artificial Intelligence, for much of his valuable support and encouragement in carrying out this work.</w:t>
+        <w:t xml:space="preserve">We wish to express our heartfelt gratitude to </w:t>
+      </w:r>
+      <w:r>
+        <w:rPr>
+          <w:rFonts w:ascii="Times New Roman" w:hAnsi="Times New Roman"/>
+          <w:b/>
+          <w:bCs/>
+          <w:sz w:val="24"/>
+        </w:rPr>
+        <w:t xml:space="preserve">Dr. Pradeep Kumar Mishra</w:t>
+      </w:r>
+      <w:r>
+        <w:rPr>
+          <w:rFonts w:ascii="Times New Roman" w:hAnsi="Times New Roman"/>
+          <w:sz w:val="24"/>
+        </w:rPr>
+        <w:t xml:space="preserve">, PC-Lead, School of Computing Science Engineering and Artificial Intelligence, for much of his valuable support and encouragement in carrying out this work.</w:t>
       </w:r>
     </w:p>
     <w:p>
@@ -7159,6 +7255,7 @@
           <w:bottom w:val="single" w:color="365F91" w:sz="6" w:space="4"/>
         </w:pBdr>
         <w:spacing w:after="200" w:before="300"/>
+        <w:jc w:val="center"/>
       </w:pPr>
       <w:r>
         <w:rPr>
@@ -7845,6 +7942,7 @@
           <w:bottom w:val="single" w:color="365F91" w:sz="6" w:space="4"/>
         </w:pBdr>
         <w:spacing w:after="200" w:before="300"/>
+        <w:jc w:val="center"/>
       </w:pPr>
       <w:r>
         <w:rPr>
@@ -10068,6 +10166,7 @@
           <w:bottom w:val="single" w:color="365F91" w:sz="6" w:space="4"/>
         </w:pBdr>
         <w:spacing w:after="200" w:before="300"/>
+        <w:jc w:val="center"/>
       </w:pPr>
       <w:r>
         <w:rPr>
@@ -14675,7 +14774,7 @@
     <w:p>
       <w:pPr>
         <w:spacing w:after="150" w:before="0"/>
-        <w:jc w:val="both"/>
+        <w:jc w:val="center"/>
       </w:pPr>
       <w:r>
         <w:rPr>
@@ -17350,6 +17449,7 @@
           <w:bottom w:val="single" w:color="365F91" w:sz="6" w:space="4"/>
         </w:pBdr>
         <w:spacing w:after="200" w:before="300"/>
+        <w:jc w:val="center"/>
       </w:pPr>
       <w:r>
         <w:rPr>
@@ -17951,7 +18051,7 @@
     <w:p>
       <w:pPr>
         <w:spacing w:after="150" w:before="0"/>
-        <w:jc w:val="both"/>
+        <w:jc w:val="center"/>
       </w:pPr>
       <w:r>
         <w:rPr>
@@ -20587,6 +20687,7 @@
           <w:bottom w:val="single" w:color="365F91" w:sz="6" w:space="4"/>
         </w:pBdr>
         <w:spacing w:after="200" w:before="300"/>
+        <w:jc w:val="center"/>
       </w:pPr>
       <w:r>
         <w:rPr>
@@ -30455,6 +30556,7 @@
           <w:bottom w:val="single" w:color="365F91" w:sz="6" w:space="4"/>
         </w:pBdr>
         <w:spacing w:after="200" w:before="300"/>
+        <w:jc w:val="center"/>
       </w:pPr>
       <w:r>
         <w:rPr>
@@ -31842,6 +31944,7 @@
           <w:bottom w:val="single" w:color="365F91" w:sz="6" w:space="4"/>
         </w:pBdr>
         <w:spacing w:after="200" w:before="300"/>
+        <w:jc w:val="center"/>
       </w:pPr>
       <w:r>
         <w:rPr>
@@ -34637,6 +34740,7 @@
           <w:bottom w:val="single" w:color="365F91" w:sz="6" w:space="4"/>
         </w:pBdr>
         <w:spacing w:after="200" w:before="300"/>
+        <w:jc w:val="center"/>
       </w:pPr>
       <w:r>
         <w:rPr>
@@ -35192,6 +35296,7 @@
           <w:bottom w:val="single" w:color="365F91" w:sz="6" w:space="4"/>
         </w:pBdr>
         <w:spacing w:after="200" w:before="300"/>
+        <w:jc w:val="center"/>
       </w:pPr>
       <w:r>
         <w:rPr>
@@ -36512,6 +36617,7 @@
           <w:bottom w:val="single" w:color="365F91" w:sz="6" w:space="4"/>
         </w:pBdr>
         <w:spacing w:after="200" w:before="300"/>
+        <w:jc w:val="center"/>
       </w:pPr>
       <w:r>
         <w:rPr>
@@ -36561,6 +36667,7 @@
           <w:bottom w:val="single" w:color="365F91" w:sz="6" w:space="4"/>
         </w:pBdr>
         <w:spacing w:after="200" w:before="300"/>
+        <w:jc w:val="center"/>
       </w:pPr>
       <w:r>
         <w:rPr>
@@ -36662,6 +36769,7 @@
           <w:bottom w:val="single" w:color="365F91" w:sz="6" w:space="4"/>
         </w:pBdr>
         <w:spacing w:after="200" w:before="300"/>
+        <w:jc w:val="center"/>
       </w:pPr>
       <w:r>
         <w:rPr>
@@ -37153,6 +37261,7 @@
           <w:bottom w:val="single" w:color="365F91" w:sz="6" w:space="4"/>
         </w:pBdr>
         <w:spacing w:after="200" w:before="300"/>
+        <w:jc w:val="center"/>
       </w:pPr>
       <w:r>
         <w:rPr>
@@ -37704,6 +37813,7 @@
           <w:bottom w:val="single" w:color="365F91" w:sz="6" w:space="4"/>
         </w:pBdr>
         <w:spacing w:after="200" w:before="300"/>
+        <w:jc w:val="center"/>
       </w:pPr>
       <w:r>
         <w:rPr>
@@ -38446,7 +38556,7 @@
     </w:p>
     <w:p>
       <w:pPr>
-        <w:jc w:val="left"/>
+        <w:jc w:val="center"/>
         <w:spacing w:before="240" w:after="120"/>
       </w:pPr>
       <w:r>
@@ -38567,7 +38677,7 @@
     </w:p>
     <w:p>
       <w:pPr>
-        <w:jc w:val="left"/>
+        <w:jc w:val="center"/>
         <w:spacing w:before="240" w:after="120"/>
       </w:pPr>
       <w:r>

</xml_diff>